<commit_message>
Update engagement letter: Arora Chawla Goel & Co, 5% fee, CA services, travel expenses
- Set Advisor to Arora Chawla Goel & Co (Chartered Accountants)
- Fix success fee at 5% of capital raised
- Revise role clause: firm can provide accounting/tax/advisory and India
  office set-up under a separate engagement/retainer
- Travel expenses charged on actuals and borne by the Company

Co-Authored-By: Claude Opus 4.8 <noreply@anthropic.com>
Claude-Session: https://claude.ai/code/session_0124cB6TwydY2Pwotr2dBrBD
</commit_message>
<xml_diff>
--- a/Zuvees_Engagement_Letter_DRAFT.docx
+++ b/Zuvees_Engagement_Letter_DRAFT.docx
@@ -11,7 +11,19 @@
           <w:sz w:val="26"/>
           <w:szCs w:val="26"/>
         </w:rPr>
-        <w:t xml:space="preserve">[ADVISOR NAME / ADVISORY FIRM]</w:t>
+        <w:t xml:space="preserve">ARORA CHAWLA GOEL &amp; CO</w:t>
+      </w:r>
+    </w:p>
+    <w:p>
+      <w:r>
+        <w:rPr>
+          <w:rFonts w:ascii="Calibri" w:cs="Calibri" w:eastAsia="Calibri" w:hAnsi="Calibri"/>
+          <w:i/>
+          <w:iCs/>
+          <w:sz w:val="20"/>
+          <w:szCs w:val="20"/>
+        </w:rPr>
+        <w:t xml:space="preserve">Chartered Accountants</w:t>
       </w:r>
     </w:p>
     <w:p>
@@ -177,7 +189,7 @@
           <w:sz w:val="22"/>
           <w:szCs w:val="22"/>
         </w:rPr>
-        <w:t xml:space="preserve">[Advisor Name]</w:t>
+        <w:t xml:space="preserve">Arora Chawla Goel &amp; Co</w:t>
       </w:r>
       <w:r>
         <w:rPr>
@@ -243,7 +255,21 @@
           <w:sz w:val="22"/>
           <w:szCs w:val="22"/>
         </w:rPr>
-        <w:t xml:space="preserve">Our role is limited to identifying and facilitating the introduction and supporting communication between the parties. We do not provide legal, tax, financial, accounting or investment advice, and nothing we do is a guarantee that any investment will be made. The decision to invest rests solely with the Introduced Investor, and the decision to accept any investment rests solely with the Company. Each party is responsible for its own due diligence.</w:t>
+        <w:t xml:space="preserve">Our role under this engagement is limited to identifying and facilitating the introduction to the Introduced Investor and supporting communication between the parties. Nothing in this letter is a guarantee that any investment will be made. The decision to invest rests solely with the Introduced Investor, and the decision to accept any investment rests solely with the Company. Each party is responsible for its own due diligence.</w:t>
+      </w:r>
+    </w:p>
+    <w:p>
+      <w:pPr>
+        <w:spacing w:after="160" w:line="276"/>
+        <w:jc w:val="both"/>
+      </w:pPr>
+      <w:r>
+        <w:rPr>
+          <w:rFonts w:ascii="Calibri" w:cs="Calibri" w:eastAsia="Calibri" w:hAnsi="Calibri"/>
+          <w:sz w:val="22"/>
+          <w:szCs w:val="22"/>
+        </w:rPr>
+        <w:t xml:space="preserve">The Advisor is a firm of Chartered Accountants and separately provides accounting, tax, regulatory, advisory and India market-entry and office set-up services. Any such services are outside the scope of this letter and, if required by the Company, will be provided under a separate engagement, with fees or a retainer to be agreed in writing.</w:t>
       </w:r>
     </w:p>
     <w:p>
@@ -282,7 +308,7 @@
           <w:sz w:val="22"/>
           <w:szCs w:val="22"/>
         </w:rPr>
-        <w:t xml:space="preserve">[___]%</w:t>
+        <w:t xml:space="preserve">5% (five percent)</w:t>
       </w:r>
       <w:r>
         <w:rPr>
@@ -493,7 +519,7 @@
           <w:sz w:val="22"/>
           <w:szCs w:val="22"/>
         </w:rPr>
-        <w:t xml:space="preserve">Each party bears its own costs in connection with this engagement. Any expense to be reimbursed by the Company must be agreed in writing in advance.</w:t>
+        <w:t xml:space="preserve">Each party bears its own general costs in connection with this engagement. All travel-related expenses incurred by the Advisor in connection with this engagement shall be charged to the Company on an actuals basis and borne by the Company. Any other expense to be reimbursed by the Company must be agreed in writing in advance.</w:t>
       </w:r>
     </w:p>
     <w:p>
@@ -602,17 +628,17 @@
           <w:sz w:val="22"/>
           <w:szCs w:val="22"/>
         </w:rPr>
-        <w:t xml:space="preserve">[Advisor Name]</w:t>
-      </w:r>
-    </w:p>
-    <w:p>
-      <w:r>
-        <w:rPr>
-          <w:rFonts w:ascii="Calibri" w:cs="Calibri" w:eastAsia="Calibri" w:hAnsi="Calibri"/>
-          <w:sz w:val="22"/>
-          <w:szCs w:val="22"/>
-        </w:rPr>
-        <w:t xml:space="preserve">For and on behalf of [Advisory Firm]</w:t>
+        <w:t xml:space="preserve">Name: [Partner Name]</w:t>
+      </w:r>
+    </w:p>
+    <w:p>
+      <w:r>
+        <w:rPr>
+          <w:rFonts w:ascii="Calibri" w:cs="Calibri" w:eastAsia="Calibri" w:hAnsi="Calibri"/>
+          <w:sz w:val="22"/>
+          <w:szCs w:val="22"/>
+        </w:rPr>
+        <w:t xml:space="preserve">For and on behalf of Arora Chawla Goel &amp; Co, Chartered Accountants</w:t>
       </w:r>
     </w:p>
     <w:p>

</xml_diff>

<commit_message>
Add 1% equity clause and set New Delhi jurisdiction in engagement letter
- New clause 4 (Equity Consideration): 1% fully-diluted equity in addition
  to the 5% cash success fee, tied to the Advisor's broader role
- Governing law set to India, exclusive jurisdiction of New Delhi courts
- Renumber subsequent clauses and update survival reference

Co-Authored-By: Claude Opus 4.8 <noreply@anthropic.com>
Claude-Session: https://claude.ai/code/session_0124cB6TwydY2Pwotr2dBrBD
</commit_message>
<xml_diff>
--- a/Zuvees_Engagement_Letter_DRAFT.docx
+++ b/Zuvees_Engagement_Letter_DRAFT.docx
@@ -331,7 +331,54 @@
           <w:sz w:val="22"/>
           <w:szCs w:val="22"/>
         </w:rPr>
-        <w:t xml:space="preserve">4. Payment Terms</w:t>
+        <w:t xml:space="preserve">4. Equity Consideration</w:t>
+      </w:r>
+    </w:p>
+    <w:p>
+      <w:pPr>
+        <w:spacing w:after="160" w:line="276"/>
+        <w:jc w:val="both"/>
+      </w:pPr>
+      <w:r>
+        <w:rPr>
+          <w:rFonts w:ascii="Calibri" w:cs="Calibri" w:eastAsia="Calibri" w:hAnsi="Calibri"/>
+          <w:sz w:val="22"/>
+          <w:szCs w:val="22"/>
+        </w:rPr>
+        <w:t xml:space="preserve">In addition to the Success Fee, and in recognition of the Advisor’s broader role in supporting the Company, the Company agrees to issue to the Advisor (or its nominee) equity equal to </w:t>
+      </w:r>
+      <w:r>
+        <w:rPr>
+          <w:rFonts w:ascii="Calibri" w:cs="Calibri" w:eastAsia="Calibri" w:hAnsi="Calibri"/>
+          <w:b/>
+          <w:bCs/>
+          <w:sz w:val="22"/>
+          <w:szCs w:val="22"/>
+        </w:rPr>
+        <w:t xml:space="preserve">1% (one percent)</w:t>
+      </w:r>
+      <w:r>
+        <w:rPr>
+          <w:rFonts w:ascii="Calibri" w:cs="Calibri" w:eastAsia="Calibri" w:hAnsi="Calibri"/>
+          <w:sz w:val="22"/>
+          <w:szCs w:val="22"/>
+        </w:rPr>
+        <w:t xml:space="preserve"> of the fully-diluted share capital of the Company, calculated as at completion of the investment from the Introduced Investor. The specific instrument, timing and documentation of this equity shall be agreed in writing between the parties and given effect through the Company’s usual corporate procedures.</w:t>
+      </w:r>
+    </w:p>
+    <w:p>
+      <w:pPr>
+        <w:spacing w:after="80" w:before="120"/>
+      </w:pPr>
+      <w:r>
+        <w:rPr>
+          <w:rFonts w:ascii="Calibri" w:cs="Calibri" w:eastAsia="Calibri" w:hAnsi="Calibri"/>
+          <w:b/>
+          <w:bCs/>
+          <w:sz w:val="22"/>
+          <w:szCs w:val="22"/>
+        </w:rPr>
+        <w:t xml:space="preserve">5. Payment Terms</w:t>
       </w:r>
     </w:p>
     <w:p>
@@ -360,7 +407,7 @@
           <w:sz w:val="22"/>
           <w:szCs w:val="22"/>
         </w:rPr>
-        <w:t xml:space="preserve">5. Tail Period</w:t>
+        <w:t xml:space="preserve">6. Tail Period</w:t>
       </w:r>
     </w:p>
     <w:p>
@@ -389,7 +436,7 @@
           <w:sz w:val="22"/>
           <w:szCs w:val="22"/>
         </w:rPr>
-        <w:t xml:space="preserve">6. Non-Circumvention</w:t>
+        <w:t xml:space="preserve">7. Non-Circumvention</w:t>
       </w:r>
     </w:p>
     <w:p>
@@ -418,7 +465,7 @@
           <w:sz w:val="22"/>
           <w:szCs w:val="22"/>
         </w:rPr>
-        <w:t xml:space="preserve">7. Confidentiality</w:t>
+        <w:t xml:space="preserve">8. Confidentiality</w:t>
       </w:r>
     </w:p>
     <w:p>
@@ -447,7 +494,7 @@
           <w:sz w:val="22"/>
           <w:szCs w:val="22"/>
         </w:rPr>
-        <w:t xml:space="preserve">8. Exclusivity</w:t>
+        <w:t xml:space="preserve">9. Exclusivity</w:t>
       </w:r>
     </w:p>
     <w:p>
@@ -476,21 +523,21 @@
           <w:sz w:val="22"/>
           <w:szCs w:val="22"/>
         </w:rPr>
-        <w:t xml:space="preserve">9. Term and Termination</w:t>
-      </w:r>
-    </w:p>
-    <w:p>
-      <w:pPr>
-        <w:spacing w:after="160" w:line="276"/>
-        <w:jc w:val="both"/>
-      </w:pPr>
-      <w:r>
-        <w:rPr>
-          <w:rFonts w:ascii="Calibri" w:cs="Calibri" w:eastAsia="Calibri" w:hAnsi="Calibri"/>
-          <w:sz w:val="22"/>
-          <w:szCs w:val="22"/>
-        </w:rPr>
-        <w:t xml:space="preserve">This engagement takes effect on the date of the last signature below and continues until completed or terminated. Either party may terminate on [thirty (30)] days’ written notice. Clauses 3 to 7 (Success Fee, Payment Terms, Tail Period, Non-Circumvention and Confidentiality) survive termination.</w:t>
+        <w:t xml:space="preserve">10. Term and Termination</w:t>
+      </w:r>
+    </w:p>
+    <w:p>
+      <w:pPr>
+        <w:spacing w:after="160" w:line="276"/>
+        <w:jc w:val="both"/>
+      </w:pPr>
+      <w:r>
+        <w:rPr>
+          <w:rFonts w:ascii="Calibri" w:cs="Calibri" w:eastAsia="Calibri" w:hAnsi="Calibri"/>
+          <w:sz w:val="22"/>
+          <w:szCs w:val="22"/>
+        </w:rPr>
+        <w:t xml:space="preserve">This engagement takes effect on the date of the last signature below and continues until completed or terminated. Either party may terminate on [thirty (30)] days’ written notice. Clauses 3 to 8 (Success Fee, Equity Consideration, Payment Terms, Tail Period, Non-Circumvention and Confidentiality) survive termination.</w:t>
       </w:r>
     </w:p>
     <w:p>
@@ -505,7 +552,7 @@
           <w:sz w:val="22"/>
           <w:szCs w:val="22"/>
         </w:rPr>
-        <w:t xml:space="preserve">10. Expenses</w:t>
+        <w:t xml:space="preserve">11. Expenses</w:t>
       </w:r>
     </w:p>
     <w:p>
@@ -534,7 +581,7 @@
           <w:sz w:val="22"/>
           <w:szCs w:val="22"/>
         </w:rPr>
-        <w:t xml:space="preserve">11. Liability</w:t>
+        <w:t xml:space="preserve">12. Liability</w:t>
       </w:r>
     </w:p>
     <w:p>
@@ -563,21 +610,21 @@
           <w:sz w:val="22"/>
           <w:szCs w:val="22"/>
         </w:rPr>
-        <w:t xml:space="preserve">12. Governing Law</w:t>
-      </w:r>
-    </w:p>
-    <w:p>
-      <w:pPr>
-        <w:spacing w:after="160" w:line="276"/>
-        <w:jc w:val="both"/>
-      </w:pPr>
-      <w:r>
-        <w:rPr>
-          <w:rFonts w:ascii="Calibri" w:cs="Calibri" w:eastAsia="Calibri" w:hAnsi="Calibri"/>
-          <w:sz w:val="22"/>
-          <w:szCs w:val="22"/>
-        </w:rPr>
-        <w:t xml:space="preserve">This letter is governed by the laws of [the Dubai International Financial Centre (DIFC) / the Emirate of Dubai, United Arab Emirates], and the parties submit to the exclusive jurisdiction of its courts.</w:t>
+        <w:t xml:space="preserve">13. Governing Law</w:t>
+      </w:r>
+    </w:p>
+    <w:p>
+      <w:pPr>
+        <w:spacing w:after="160" w:line="276"/>
+        <w:jc w:val="both"/>
+      </w:pPr>
+      <w:r>
+        <w:rPr>
+          <w:rFonts w:ascii="Calibri" w:cs="Calibri" w:eastAsia="Calibri" w:hAnsi="Calibri"/>
+          <w:sz w:val="22"/>
+          <w:szCs w:val="22"/>
+        </w:rPr>
+        <w:t xml:space="preserve">This letter is governed by and construed in accordance with the laws of India, and the parties submit to the exclusive jurisdiction of the courts of New Delhi.</w:t>
       </w:r>
     </w:p>
     <w:p>

</xml_diff>